<commit_message>
all papers: correct author name to Gunveer Singh Kalsi
Was "Gunveer Sinh Kalsi" in ten places across four manuscripts. Corrected in all
of them rather than only the one being submitted, since it is the same author.

Co-Authored-By: Claude Opus 5 <noreply@anthropic.com>
</commit_message>
<xml_diff>
--- a/build_scaling/ScaleFixesLocalErrorsFirst_TitlePage.docx
+++ b/build_scaling/ScaleFixesLocalErrorsFirst_TitlePage.docx
@@ -80,7 +80,7 @@
           <w:b/>
           <w:bCs/>
         </w:rPr>
-        <w:t xml:space="preserve">Gunveer Sinh Kalsi</w:t>
+        <w:t xml:space="preserve">Gunveer Singh Kalsi</w:t>
       </w:r>
       <w:r>
         <w:br/>
@@ -369,7 +369,7 @@
           <w:b/>
           <w:bCs/>
         </w:rPr>
-        <w:t xml:space="preserve">Gunveer Sinh Kalsi</w:t>
+        <w:t xml:space="preserve">Gunveer Singh Kalsi</w:t>
       </w:r>
       <w:r>
         <w:t xml:space="preserve"> </w:t>

</xml_diff>